<commit_message>
updating the source files for the informative data
</commit_message>
<xml_diff>
--- a/categories/Medical_Conditions/דימום מאסיבי - פורץ2.docx
+++ b/categories/Medical_Conditions/דימום מאסיבי - פורץ2.docx
@@ -22,7 +22,18 @@
           <w:szCs w:val="44"/>
           <w:rtl/>
         </w:rPr>
-        <w:t>מערך שיעור: דימום מאסיבי (פורץ)</w:t>
+        <w:t xml:space="preserve">מערך שיעור: דימום </w:t>
+      </w:r>
+      <w:r>
+        <w:rPr>
+          <w:rFonts w:hint="cs"/>
+          <w:b/>
+          <w:bCs/>
+          <w:sz w:val="44"/>
+          <w:szCs w:val="44"/>
+          <w:rtl/>
+        </w:rPr>
+        <w:t>פורץ</w:t>
       </w:r>
     </w:p>
     <w:p>
@@ -94,34 +105,79 @@
         <w:rPr>
           <w:rtl/>
         </w:rPr>
-        <w:t>דימום מאסיבי הוא מצב שבו דם יוצא מכלי דם גדול (בדרך כלל עורק) בקצב מהיר (בצורה של שפריץ או זרימה חזקה ומתמשכת)</w:t>
-      </w:r>
-      <w:r>
+        <w:t xml:space="preserve">דימום </w:t>
+      </w:r>
+      <w:r>
+        <w:rPr>
+          <w:rFonts w:hint="cs"/>
+          <w:rtl/>
+        </w:rPr>
+        <w:t>פורץ</w:t>
+      </w:r>
+      <w:r>
+        <w:rPr>
+          <w:rtl/>
+        </w:rPr>
+        <w:t xml:space="preserve"> הוא מצב שבו דם יוצא מכלי דם גדול (בדרך כלל עורק) בקצב מהיר (בצורה של שפריץ או זרימה חזקה ומתמשכת)</w:t>
+      </w:r>
+      <w:r>
+        <w:rPr>
+          <w:rFonts w:hint="cs"/>
+          <w:rtl/>
+        </w:rPr>
+        <w:t>.</w:t>
+      </w:r>
+    </w:p>
+    <w:p>
+      <w:pPr>
+        <w:bidi/>
+        <w:spacing w:line="360" w:lineRule="auto"/>
+        <w:rPr>
+          <w:rtl/>
+        </w:rPr>
+      </w:pPr>
+      <w:r>
+        <w:rPr>
+          <w:b/>
+          <w:bCs/>
+          <w:rtl/>
+        </w:rPr>
+        <w:t>אדם יכול לדמם למוות מפגיעה בעורק ראשי תוך פחות מ-3 דקות</w:t>
+      </w:r>
+      <w:r>
+        <w:rPr>
+          <w:rFonts w:hint="cs"/>
+          <w:rtl/>
+        </w:rPr>
         <w:t xml:space="preserve">. </w:t>
       </w:r>
-      <w:r>
-        <w:rPr>
-          <w:b/>
-          <w:bCs/>
-          <w:rtl/>
-        </w:rPr>
-        <w:t>אדם יכול לדמם למוות מפגיעה בעורק ראשי תוך פחות מ-3 דקות</w:t>
-      </w:r>
-      <w:r>
-        <w:rPr>
-          <w:b/>
-          <w:bCs/>
-        </w:rPr>
-        <w:t>.</w:t>
-      </w:r>
-      <w:r>
+    </w:p>
+    <w:p>
+      <w:pPr>
+        <w:bidi/>
+        <w:spacing w:line="360" w:lineRule="auto"/>
+        <w:rPr>
+          <w:rtl/>
+        </w:rPr>
+      </w:pPr>
+      <w:r>
+        <w:rPr>
+          <w:rtl/>
+        </w:rPr>
+        <w:t>לכן,</w:t>
+      </w:r>
+      <w:r>
+        <w:rPr>
+          <w:rFonts w:hint="cs"/>
+          <w:rtl/>
+        </w:rPr>
         <w:t xml:space="preserve"> </w:t>
       </w:r>
       <w:r>
         <w:rPr>
           <w:rtl/>
         </w:rPr>
-        <w:t>לכן, עצירת הדימום קודמת לכל טיפול אחר, כולל טיפול בנתיב אוויר</w:t>
+        <w:t>עצירת הדימום קודמת לכל טיפול אחר, כולל טיפול בנתיב אוויר</w:t>
       </w:r>
       <w:r>
         <w:t>.</w:t>
@@ -248,11 +304,12 @@
       </w:r>
       <w:r>
         <w:rPr>
-          <w:b/>
-          <w:bCs/>
-          <w:rtl/>
-        </w:rPr>
-        <w:t>טיפול אינטראקטיבי</w:t>
+          <w:rFonts w:hint="cs"/>
+          <w:b/>
+          <w:bCs/>
+          <w:rtl/>
+        </w:rPr>
+        <w:t>אופן הטיפול</w:t>
       </w:r>
     </w:p>
     <w:p>
@@ -267,26 +324,37 @@
       </w:pPr>
       <w:r>
         <w:rPr>
-          <w:b/>
-          <w:bCs/>
-          <w:rtl/>
-        </w:rPr>
-        <w:t>בטיחות ולחיצה ישירה מיידית</w:t>
-      </w:r>
-      <w:r>
-        <w:rPr>
-          <w:b/>
-          <w:bCs/>
-        </w:rPr>
-        <w:t>:</w:t>
-      </w:r>
-      <w:r>
-        <w:rPr>
-          <w:rtl/>
-        </w:rPr>
-        <w:t>שלב ראשון</w:t>
-      </w:r>
-      <w:r>
+          <w:rFonts w:hint="cs"/>
+          <w:b/>
+          <w:bCs/>
+          <w:rtl/>
+        </w:rPr>
+        <w:t>ראשית,</w:t>
+      </w:r>
+      <w:r>
+        <w:rPr>
+          <w:rFonts w:hint="cs"/>
+          <w:rtl/>
+        </w:rPr>
+        <w:t xml:space="preserve"> וודאו</w:t>
+      </w:r>
+      <w:r>
+        <w:rPr>
+          <w:rtl/>
+        </w:rPr>
+        <w:t xml:space="preserve"> שהסביבה בטוחה</w:t>
+      </w:r>
+      <w:r>
+        <w:rPr>
+          <w:rFonts w:hint="cs"/>
+          <w:rtl/>
+        </w:rPr>
+        <w:t xml:space="preserve"> לטיפול</w:t>
+      </w:r>
+      <w:r>
+        <w:rPr>
+          <w:rtl/>
+        </w:rPr>
         <w:t>.</w:t>
       </w:r>
     </w:p>
@@ -304,23 +372,6 @@
         <w:rPr>
           <w:rtl/>
         </w:rPr>
-        <w:t>וודאו שהסביבה בטוחה.</w:t>
-      </w:r>
-    </w:p>
-    <w:p>
-      <w:pPr>
-        <w:pStyle w:val="ListParagraph"/>
-        <w:numPr>
-          <w:ilvl w:val="0"/>
-          <w:numId w:val="3"/>
-        </w:numPr>
-        <w:bidi/>
-        <w:spacing w:line="360" w:lineRule="auto"/>
-      </w:pPr>
-      <w:r>
-        <w:rPr>
-          <w:rtl/>
-        </w:rPr>
         <w:t xml:space="preserve">הפעילו </w:t>
       </w:r>
       <w:r>
@@ -335,10 +386,14 @@
         <w:rPr>
           <w:rtl/>
         </w:rPr>
-        <w:t xml:space="preserve"> באמצעות שתי הידיים (עדיף עם גזה או בד נקי) ישירות על מקור הדימום. אל תרפו כדי "לבדוק אם זה הפסיק</w:t>
-      </w:r>
-      <w:r>
-        <w:t>".</w:t>
+        <w:t xml:space="preserve"> באמצעות שתי הידיים (עדיף עם גזה או בד נקי) ישירות על מקור הדימום. אל תרפו </w:t>
+      </w:r>
+      <w:r>
+        <w:rPr>
+          <w:rFonts w:hint="cs"/>
+          <w:rtl/>
+        </w:rPr>
+        <w:t>עד עד הנחיית גורם רפואי.</w:t>
       </w:r>
     </w:p>
     <w:p>
@@ -489,7 +544,7 @@
           <w:bCs/>
           <w:rtl/>
         </w:rPr>
-        <w:t>הערכת מיקום והנחת חסם עורקים (טורניקה)</w:t>
+        <w:t xml:space="preserve">הנחת חסם עורקים </w:t>
       </w:r>
     </w:p>
     <w:p>
@@ -506,16 +561,59 @@
         <w:rPr>
           <w:rtl/>
         </w:rPr>
-        <w:t>אם מדובר בדימום פורץ בגפה והלחץ הישיר לא עוזר (או שיש פצועים מרובים), הנחו חסם עורקים</w:t>
-      </w:r>
-      <w:r>
-        <w:t xml:space="preserve"> (</w:t>
-      </w:r>
-      <w:r>
-        <w:rPr>
-          <w:rtl/>
-        </w:rPr>
-        <w:t>כמו חסם</w:t>
+        <w:t xml:space="preserve">אם מדובר </w:t>
+      </w:r>
+      <w:r>
+        <w:rPr>
+          <w:b/>
+          <w:bCs/>
+          <w:rtl/>
+        </w:rPr>
+        <w:t>בדימום פורץ בגפה</w:t>
+      </w:r>
+      <w:r>
+        <w:rPr>
+          <w:rFonts w:hint="cs"/>
+          <w:b/>
+          <w:bCs/>
+          <w:rtl/>
+        </w:rPr>
+        <w:t>,</w:t>
+      </w:r>
+      <w:r>
+        <w:rPr>
+          <w:rtl/>
+        </w:rPr>
+        <w:t xml:space="preserve"> והלחץ הישיר לא עוזר (או שיש פצועים מרובים), הנ</w:t>
+      </w:r>
+      <w:r>
+        <w:rPr>
+          <w:rFonts w:hint="cs"/>
+          <w:rtl/>
+        </w:rPr>
+        <w:t>י</w:t>
+      </w:r>
+      <w:r>
+        <w:rPr>
+          <w:rtl/>
+        </w:rPr>
+        <w:t>חו חסם עורקים</w:t>
+      </w:r>
+      <w:r>
+        <w:t xml:space="preserve"> </w:t>
+      </w:r>
+      <w:r>
+        <w:rPr>
+          <w:rFonts w:hint="cs"/>
+          <w:rtl/>
+        </w:rPr>
+        <w:t xml:space="preserve">(למשל </w:t>
+      </w:r>
+      <w:r>
+        <w:rPr>
+          <w:rtl/>
+        </w:rPr>
+        <w:t>חסם</w:t>
       </w:r>
       <w:r>
         <w:t xml:space="preserve"> CAT </w:t>
@@ -527,7 +625,14 @@
         <w:t>או סיליקון</w:t>
       </w:r>
       <w:r>
-        <w:t xml:space="preserve">) </w:t>
+        <w:rPr>
+          <w:rFonts w:hint="cs"/>
+          <w:rtl/>
+        </w:rPr>
+        <w:t>)</w:t>
+      </w:r>
+      <w:r>
+        <w:t xml:space="preserve"> </w:t>
       </w:r>
       <w:r>
         <w:rPr>
@@ -576,7 +681,7 @@
           <w:noProof/>
         </w:rPr>
         <w:drawing>
-          <wp:inline distT="0" distB="0" distL="0" distR="0" wp14:anchorId="2F9BA930" wp14:editId="3DA6343B">
+          <wp:inline distT="0" distB="0" distL="0" distR="0" wp14:anchorId="2F9BA930" wp14:editId="7051E593">
             <wp:extent cx="1680947" cy="1680947"/>
             <wp:effectExtent l="0" t="0" r="0" b="0"/>
             <wp:docPr id="3" name="Picture 3" descr="Tourniquet free icons designed by Freepik"/>
@@ -707,22 +812,6 @@
         </w:rPr>
         <w:t>רישום זמן קריטי</w:t>
       </w:r>
-      <w:r>
-        <w:rPr>
-          <w:b/>
-          <w:bCs/>
-        </w:rPr>
-        <w:t>:</w:t>
-      </w:r>
-      <w:r>
-        <w:rPr>
-          <w:rtl/>
-        </w:rPr>
-        <w:t>חובה</w:t>
-      </w:r>
-      <w:r>
-        <w:t>.</w:t>
-      </w:r>
     </w:p>
     <w:p>
       <w:pPr>
@@ -736,11 +825,44 @@
       </w:pPr>
       <w:r>
         <w:rPr>
+          <w:rFonts w:hint="cs"/>
+          <w:b/>
+          <w:bCs/>
+          <w:rtl/>
+        </w:rPr>
+        <w:t>שלב זה הינו חובה</w:t>
+      </w:r>
+      <w:r>
+        <w:rPr>
+          <w:rFonts w:hint="cs"/>
+          <w:b/>
+          <w:bCs/>
+          <w:rtl/>
+        </w:rPr>
+        <w:t>.</w:t>
+      </w:r>
+    </w:p>
+    <w:p>
+      <w:pPr>
+        <w:pStyle w:val="ListParagraph"/>
+        <w:numPr>
+          <w:ilvl w:val="0"/>
+          <w:numId w:val="3"/>
+        </w:numPr>
+        <w:bidi/>
+        <w:spacing w:line="360" w:lineRule="auto"/>
+      </w:pPr>
+      <w:r>
+        <w:rPr>
           <w:rtl/>
         </w:rPr>
         <w:t>מיד לאחר קשירת חסם העורקים</w:t>
       </w:r>
       <w:r>
+        <w:rPr>
+          <w:rFonts w:hint="cs"/>
+          <w:rtl/>
+        </w:rPr>
         <w:t xml:space="preserve">, </w:t>
       </w:r>
       <w:r>
@@ -893,6 +1015,11 @@
       <w:pPr>
         <w:bidi/>
         <w:spacing w:line="360" w:lineRule="auto"/>
+        <w:rPr>
+          <w:b/>
+          <w:bCs/>
+          <w:rtl/>
+        </w:rPr>
       </w:pPr>
       <w:r>
         <w:rPr>
@@ -919,14 +1046,16 @@
           <w:bCs/>
           <w:rtl/>
         </w:rPr>
-        <w:t>טיפול בדימום באזורי חיבור (מפשעה, בית שחי, צוואר)</w:t>
-      </w:r>
-      <w:r>
-        <w:rPr>
-          <w:b/>
-          <w:bCs/>
-        </w:rPr>
-        <w:t>:</w:t>
+        <w:t xml:space="preserve">טיפול בדימום באזורי חיבור </w:t>
+      </w:r>
+      <w:r>
+        <w:rPr>
+          <w:rFonts w:hint="cs"/>
+          <w:b/>
+          <w:bCs/>
+          <w:rtl/>
+        </w:rPr>
+        <w:t xml:space="preserve">: </w:t>
       </w:r>
     </w:p>
     <w:p>
@@ -943,7 +1072,37 @@
         <w:rPr>
           <w:rtl/>
         </w:rPr>
-        <w:t>באזורים אלו לא ניתן להניח חסם עורקים.</w:t>
+        <w:t xml:space="preserve">באזורים אלו </w:t>
+      </w:r>
+      <w:r>
+        <w:rPr>
+          <w:b/>
+          <w:bCs/>
+          <w:rtl/>
+        </w:rPr>
+        <w:t>(מפשעה, בית שחי, צוואר)</w:t>
+      </w:r>
+      <w:r>
+        <w:rPr>
+          <w:rFonts w:hint="cs"/>
+          <w:b/>
+          <w:bCs/>
+          <w:rtl/>
+        </w:rPr>
+        <w:t>,</w:t>
+      </w:r>
+      <w:r>
+        <w:rPr>
+          <w:rFonts w:hint="cs"/>
+          <w:rtl/>
+        </w:rPr>
+        <w:t xml:space="preserve"> </w:t>
+      </w:r>
+      <w:r>
+        <w:rPr>
+          <w:rtl/>
+        </w:rPr>
+        <w:t>לא ניתן להניח חסם עורקים.</w:t>
       </w:r>
     </w:p>
     <w:p>
@@ -958,34 +1117,17 @@
       </w:pPr>
       <w:r>
         <w:rPr>
+          <w:rFonts w:hint="cs"/>
           <w:rtl/>
         </w:rPr>
         <w:lastRenderedPageBreak/>
-        <w:t xml:space="preserve">הטיפול מבוסס על </w:t>
-      </w:r>
-      <w:r>
-        <w:rPr>
-          <w:b/>
-          <w:bCs/>
-          <w:rtl/>
-        </w:rPr>
-        <w:t>דחיסת תחבושות</w:t>
-      </w:r>
-      <w:r>
-        <w:rPr>
-          <w:b/>
-          <w:bCs/>
-        </w:rPr>
-        <w:t xml:space="preserve"> (Wound Packing)</w:t>
-      </w:r>
-      <w:r>
-        <w:t xml:space="preserve"> </w:t>
-      </w:r>
-      <w:r>
-        <w:rPr>
-          <w:rtl/>
-        </w:rPr>
-        <w:t>עמוק לתוך הפצע ולחיצה מתמשכת וחזקה עם שתי הידיים במשך 3 דקות לפחות (אם משתמשים בתחבושת המוסטטית עוצרת דימום) או 10 דקות (בתחבושת רגילה)</w:t>
+        <w:t xml:space="preserve">דחסו תחבושת מתאימה ולחצו </w:t>
+      </w:r>
+      <w:r>
+        <w:rPr>
+          <w:rtl/>
+        </w:rPr>
+        <w:t>לחיצה מתמשכת וחזקה עם שתי הידיים במשך 3 דקות לפחות (אם משתמשים בתחבושת המוסטטית עוצרת דימום) או 10 דקות (בתחבושת רגילה)</w:t>
       </w:r>
       <w:r>
         <w:t>.</w:t>

</xml_diff>